<commit_message>
chore: final monorepo snapshot; apps now maintained in standalone per-app repos
</commit_message>
<xml_diff>
--- a/apps/bullyproof/docs/change-request/quote-2026-06-29/reply-2026-07-07/05-minimum-audit-trail-scope.docx
+++ b/apps/bullyproof/docs/change-request/quote-2026-06-29/reply-2026-07-07/05-minimum-audit-trail-scope.docx
@@ -71,7 +71,7 @@
         <w:rPr>
           <w:i/>
         </w:rPr>
-        <w:t>The concise technical scope requested on 9 July 2026 for the minimum content-change audit capability, carved out of module M5 as an independent deliverable. Fixed price $15,950 + GST.</w:t>
+        <w:t>The concise technical scope requested on 9 July 2026 for the minimum content-change audit capability, carved out of module M5 as an independent deliverable. Fixed price $7,162.50 + GST, itemised in section 9 on the same rate card as every module quote.</w:t>
       </w:r>
     </w:p>
     <w:p>
@@ -343,7 +343,614 @@
     </w:p>
     <w:p>
       <w:r>
-        <w:t>Rate basis: the same $2,900 per day used throughout the module quotes ($21,750 / 7.5 days for the full M5 item).</w:t>
+        <w:t>Rate basis: the same discipline rate card used in every module quote issued 29 June and reaffirmed 5 July (the deep card: UX/Design $100.00/hr, Frontend $106.25/hr, Backend $112.50/hr, DevOps/Infra $118.75/hr, Product Mgmt/BA $93.75/hr). This module is carved out of M5, which was quoted on that card, so the same card applies here.</w:t>
+      </w:r>
+    </w:p>
+    <w:p>
+      <w:r>
+        <w:t>The $15,950 figure in the letter of 8 July was a round estimate given ahead of itemisation. The itemised basis below comes in under it for two reasons: the task-by-task costing itself, at the same estimating grain as the M1 and M5 work breakdowns already issued, and an overlap with the M1 Content Type build currently underway, which generalises the same curriculum and certification services this module instruments. The instrumentation and schema estimates below therefore assume those services are already open under M1 rather than re-opened cold. The itemised figure is the price.</w:t>
+      </w:r>
+    </w:p>
+    <w:p>
+      <w:r>
+        <w:t>Delivery-window basis: the estimates assume commissioning while the M1 build is current. Commissioned well after M1 has closed, the instrumentation lines would carry a modest re-estimate once those services have settled.</w:t>
+      </w:r>
+    </w:p>
+    <w:tbl>
+      <w:tblPr>
+        <w:tblStyle w:val="TableGrid"/>
+        <w:tblW w:type="auto" w:w="0"/>
+        <w:jc w:val="left"/>
+        <w:tblLook w:firstColumn="1" w:firstRow="1" w:lastColumn="0" w:lastRow="0" w:noHBand="0" w:noVBand="1" w:val="04A0"/>
+      </w:tblPr>
+      <w:tblGrid>
+        <w:gridCol w:w="2296"/>
+        <w:gridCol w:w="2296"/>
+        <w:gridCol w:w="2296"/>
+        <w:gridCol w:w="2296"/>
+      </w:tblGrid>
+      <w:tr>
+        <w:tc>
+          <w:tcPr>
+            <w:tcW w:type="dxa" w:w="2296"/>
+            <w:shd w:val="clear" w:fill="008490"/>
+          </w:tcPr>
+          <w:p>
+            <w:r>
+              <w:rPr>
+                <w:b/>
+                <w:color w:val="FFFFFF"/>
+                <w:sz w:val="19"/>
+              </w:rPr>
+            </w:r>
+            <w:r>
+              <w:rPr>
+                <w:b/>
+                <w:color w:val="FFFFFF"/>
+                <w:sz w:val="19"/>
+              </w:rPr>
+              <w:t>Discipline</w:t>
+            </w:r>
+          </w:p>
+        </w:tc>
+        <w:tc>
+          <w:tcPr>
+            <w:tcW w:type="dxa" w:w="2296"/>
+            <w:shd w:val="clear" w:fill="008490"/>
+          </w:tcPr>
+          <w:p>
+            <w:r>
+              <w:rPr>
+                <w:b/>
+                <w:color w:val="FFFFFF"/>
+                <w:sz w:val="19"/>
+              </w:rPr>
+            </w:r>
+            <w:r>
+              <w:rPr>
+                <w:b/>
+                <w:color w:val="FFFFFF"/>
+                <w:sz w:val="19"/>
+              </w:rPr>
+              <w:t>Hours</w:t>
+            </w:r>
+          </w:p>
+        </w:tc>
+        <w:tc>
+          <w:tcPr>
+            <w:tcW w:type="dxa" w:w="2296"/>
+            <w:shd w:val="clear" w:fill="008490"/>
+          </w:tcPr>
+          <w:p>
+            <w:r>
+              <w:rPr>
+                <w:b/>
+                <w:color w:val="FFFFFF"/>
+                <w:sz w:val="19"/>
+              </w:rPr>
+            </w:r>
+            <w:r>
+              <w:rPr>
+                <w:b/>
+                <w:color w:val="FFFFFF"/>
+                <w:sz w:val="19"/>
+              </w:rPr>
+              <w:t>Hourly rate</w:t>
+            </w:r>
+          </w:p>
+        </w:tc>
+        <w:tc>
+          <w:tcPr>
+            <w:tcW w:type="dxa" w:w="2296"/>
+            <w:shd w:val="clear" w:fill="008490"/>
+          </w:tcPr>
+          <w:p>
+            <w:r>
+              <w:rPr>
+                <w:b/>
+                <w:color w:val="FFFFFF"/>
+                <w:sz w:val="19"/>
+              </w:rPr>
+            </w:r>
+            <w:r>
+              <w:rPr>
+                <w:b/>
+                <w:color w:val="FFFFFF"/>
+                <w:sz w:val="19"/>
+              </w:rPr>
+              <w:t>Subtotal</w:t>
+            </w:r>
+          </w:p>
+        </w:tc>
+      </w:tr>
+      <w:tr>
+        <w:tc>
+          <w:tcPr>
+            <w:tcW w:type="dxa" w:w="2296"/>
+          </w:tcPr>
+          <w:p>
+            <w:r>
+              <w:rPr>
+                <w:sz w:val="19"/>
+              </w:rPr>
+            </w:r>
+            <w:r>
+              <w:rPr>
+                <w:sz w:val="19"/>
+              </w:rPr>
+              <w:t>UX / Design</w:t>
+            </w:r>
+          </w:p>
+        </w:tc>
+        <w:tc>
+          <w:tcPr>
+            <w:tcW w:type="dxa" w:w="2296"/>
+          </w:tcPr>
+          <w:p>
+            <w:r>
+              <w:rPr>
+                <w:sz w:val="19"/>
+              </w:rPr>
+            </w:r>
+            <w:r>
+              <w:rPr>
+                <w:sz w:val="19"/>
+              </w:rPr>
+              <w:t>2 h</w:t>
+            </w:r>
+          </w:p>
+        </w:tc>
+        <w:tc>
+          <w:tcPr>
+            <w:tcW w:type="dxa" w:w="2296"/>
+          </w:tcPr>
+          <w:p>
+            <w:r>
+              <w:rPr>
+                <w:sz w:val="19"/>
+              </w:rPr>
+            </w:r>
+            <w:r>
+              <w:rPr>
+                <w:sz w:val="19"/>
+              </w:rPr>
+              <w:t>$100.00/hr</w:t>
+            </w:r>
+          </w:p>
+        </w:tc>
+        <w:tc>
+          <w:tcPr>
+            <w:tcW w:type="dxa" w:w="2296"/>
+          </w:tcPr>
+          <w:p>
+            <w:r>
+              <w:rPr>
+                <w:sz w:val="19"/>
+              </w:rPr>
+            </w:r>
+            <w:r>
+              <w:rPr>
+                <w:sz w:val="19"/>
+              </w:rPr>
+              <w:t>$200.00</w:t>
+            </w:r>
+          </w:p>
+        </w:tc>
+      </w:tr>
+      <w:tr>
+        <w:tc>
+          <w:tcPr>
+            <w:tcW w:type="dxa" w:w="2296"/>
+            <w:shd w:val="clear" w:fill="F2F7F7"/>
+          </w:tcPr>
+          <w:p>
+            <w:r>
+              <w:rPr>
+                <w:sz w:val="19"/>
+              </w:rPr>
+            </w:r>
+            <w:r>
+              <w:rPr>
+                <w:sz w:val="19"/>
+              </w:rPr>
+              <w:t>Frontend</w:t>
+            </w:r>
+          </w:p>
+        </w:tc>
+        <w:tc>
+          <w:tcPr>
+            <w:tcW w:type="dxa" w:w="2296"/>
+            <w:shd w:val="clear" w:fill="F2F7F7"/>
+          </w:tcPr>
+          <w:p>
+            <w:r>
+              <w:rPr>
+                <w:sz w:val="19"/>
+              </w:rPr>
+            </w:r>
+            <w:r>
+              <w:rPr>
+                <w:sz w:val="19"/>
+              </w:rPr>
+              <w:t>16 h</w:t>
+            </w:r>
+          </w:p>
+        </w:tc>
+        <w:tc>
+          <w:tcPr>
+            <w:tcW w:type="dxa" w:w="2296"/>
+            <w:shd w:val="clear" w:fill="F2F7F7"/>
+          </w:tcPr>
+          <w:p>
+            <w:r>
+              <w:rPr>
+                <w:sz w:val="19"/>
+              </w:rPr>
+            </w:r>
+            <w:r>
+              <w:rPr>
+                <w:sz w:val="19"/>
+              </w:rPr>
+              <w:t>$106.25/hr</w:t>
+            </w:r>
+          </w:p>
+        </w:tc>
+        <w:tc>
+          <w:tcPr>
+            <w:tcW w:type="dxa" w:w="2296"/>
+            <w:shd w:val="clear" w:fill="F2F7F7"/>
+          </w:tcPr>
+          <w:p>
+            <w:r>
+              <w:rPr>
+                <w:sz w:val="19"/>
+              </w:rPr>
+            </w:r>
+            <w:r>
+              <w:rPr>
+                <w:sz w:val="19"/>
+              </w:rPr>
+              <w:t>$1,700.00</w:t>
+            </w:r>
+          </w:p>
+        </w:tc>
+      </w:tr>
+      <w:tr>
+        <w:tc>
+          <w:tcPr>
+            <w:tcW w:type="dxa" w:w="2296"/>
+          </w:tcPr>
+          <w:p>
+            <w:r>
+              <w:rPr>
+                <w:sz w:val="19"/>
+              </w:rPr>
+            </w:r>
+            <w:r>
+              <w:rPr>
+                <w:sz w:val="19"/>
+              </w:rPr>
+              <w:t>Backend</w:t>
+            </w:r>
+          </w:p>
+        </w:tc>
+        <w:tc>
+          <w:tcPr>
+            <w:tcW w:type="dxa" w:w="2296"/>
+          </w:tcPr>
+          <w:p>
+            <w:r>
+              <w:rPr>
+                <w:sz w:val="19"/>
+              </w:rPr>
+            </w:r>
+            <w:r>
+              <w:rPr>
+                <w:sz w:val="19"/>
+              </w:rPr>
+              <w:t>38 h</w:t>
+            </w:r>
+          </w:p>
+        </w:tc>
+        <w:tc>
+          <w:tcPr>
+            <w:tcW w:type="dxa" w:w="2296"/>
+          </w:tcPr>
+          <w:p>
+            <w:r>
+              <w:rPr>
+                <w:sz w:val="19"/>
+              </w:rPr>
+            </w:r>
+            <w:r>
+              <w:rPr>
+                <w:sz w:val="19"/>
+              </w:rPr>
+              <w:t>$112.50/hr</w:t>
+            </w:r>
+          </w:p>
+        </w:tc>
+        <w:tc>
+          <w:tcPr>
+            <w:tcW w:type="dxa" w:w="2296"/>
+          </w:tcPr>
+          <w:p>
+            <w:r>
+              <w:rPr>
+                <w:sz w:val="19"/>
+              </w:rPr>
+            </w:r>
+            <w:r>
+              <w:rPr>
+                <w:sz w:val="19"/>
+              </w:rPr>
+              <w:t>$4,275.00</w:t>
+            </w:r>
+          </w:p>
+        </w:tc>
+      </w:tr>
+      <w:tr>
+        <w:tc>
+          <w:tcPr>
+            <w:tcW w:type="dxa" w:w="2296"/>
+            <w:shd w:val="clear" w:fill="F2F7F7"/>
+          </w:tcPr>
+          <w:p>
+            <w:r>
+              <w:rPr>
+                <w:sz w:val="19"/>
+              </w:rPr>
+            </w:r>
+            <w:r>
+              <w:rPr>
+                <w:sz w:val="19"/>
+              </w:rPr>
+              <w:t>DevOps / Infra</w:t>
+            </w:r>
+          </w:p>
+        </w:tc>
+        <w:tc>
+          <w:tcPr>
+            <w:tcW w:type="dxa" w:w="2296"/>
+            <w:shd w:val="clear" w:fill="F2F7F7"/>
+          </w:tcPr>
+          <w:p>
+            <w:r>
+              <w:rPr>
+                <w:sz w:val="19"/>
+              </w:rPr>
+            </w:r>
+            <w:r>
+              <w:rPr>
+                <w:sz w:val="19"/>
+              </w:rPr>
+              <w:t>2 h</w:t>
+            </w:r>
+          </w:p>
+        </w:tc>
+        <w:tc>
+          <w:tcPr>
+            <w:tcW w:type="dxa" w:w="2296"/>
+            <w:shd w:val="clear" w:fill="F2F7F7"/>
+          </w:tcPr>
+          <w:p>
+            <w:r>
+              <w:rPr>
+                <w:sz w:val="19"/>
+              </w:rPr>
+            </w:r>
+            <w:r>
+              <w:rPr>
+                <w:sz w:val="19"/>
+              </w:rPr>
+              <w:t>$118.75/hr</w:t>
+            </w:r>
+          </w:p>
+        </w:tc>
+        <w:tc>
+          <w:tcPr>
+            <w:tcW w:type="dxa" w:w="2296"/>
+            <w:shd w:val="clear" w:fill="F2F7F7"/>
+          </w:tcPr>
+          <w:p>
+            <w:r>
+              <w:rPr>
+                <w:sz w:val="19"/>
+              </w:rPr>
+            </w:r>
+            <w:r>
+              <w:rPr>
+                <w:sz w:val="19"/>
+              </w:rPr>
+              <w:t>$237.50</w:t>
+            </w:r>
+          </w:p>
+        </w:tc>
+      </w:tr>
+      <w:tr>
+        <w:tc>
+          <w:tcPr>
+            <w:tcW w:type="dxa" w:w="2296"/>
+          </w:tcPr>
+          <w:p>
+            <w:r>
+              <w:rPr>
+                <w:sz w:val="19"/>
+              </w:rPr>
+            </w:r>
+            <w:r>
+              <w:rPr>
+                <w:sz w:val="19"/>
+              </w:rPr>
+              <w:t>Product Mgmt / BA</w:t>
+            </w:r>
+          </w:p>
+        </w:tc>
+        <w:tc>
+          <w:tcPr>
+            <w:tcW w:type="dxa" w:w="2296"/>
+          </w:tcPr>
+          <w:p>
+            <w:r>
+              <w:rPr>
+                <w:sz w:val="19"/>
+              </w:rPr>
+            </w:r>
+            <w:r>
+              <w:rPr>
+                <w:sz w:val="19"/>
+              </w:rPr>
+              <w:t>8 h</w:t>
+            </w:r>
+          </w:p>
+        </w:tc>
+        <w:tc>
+          <w:tcPr>
+            <w:tcW w:type="dxa" w:w="2296"/>
+          </w:tcPr>
+          <w:p>
+            <w:r>
+              <w:rPr>
+                <w:sz w:val="19"/>
+              </w:rPr>
+            </w:r>
+            <w:r>
+              <w:rPr>
+                <w:sz w:val="19"/>
+              </w:rPr>
+              <w:t>$93.75/hr</w:t>
+            </w:r>
+          </w:p>
+        </w:tc>
+        <w:tc>
+          <w:tcPr>
+            <w:tcW w:type="dxa" w:w="2296"/>
+          </w:tcPr>
+          <w:p>
+            <w:r>
+              <w:rPr>
+                <w:sz w:val="19"/>
+              </w:rPr>
+            </w:r>
+            <w:r>
+              <w:rPr>
+                <w:sz w:val="19"/>
+              </w:rPr>
+              <w:t>$750.00</w:t>
+            </w:r>
+          </w:p>
+        </w:tc>
+      </w:tr>
+      <w:tr>
+        <w:tc>
+          <w:tcPr>
+            <w:tcW w:type="dxa" w:w="2296"/>
+            <w:shd w:val="clear" w:fill="F2F7F7"/>
+          </w:tcPr>
+          <w:p>
+            <w:r>
+              <w:rPr>
+                <w:sz w:val="19"/>
+              </w:rPr>
+            </w:r>
+            <w:r>
+              <w:rPr>
+                <w:b/>
+                <w:sz w:val="19"/>
+              </w:rPr>
+              <w:t>Module total</w:t>
+            </w:r>
+          </w:p>
+        </w:tc>
+        <w:tc>
+          <w:tcPr>
+            <w:tcW w:type="dxa" w:w="2296"/>
+            <w:shd w:val="clear" w:fill="F2F7F7"/>
+          </w:tcPr>
+          <w:p>
+            <w:r>
+              <w:rPr>
+                <w:sz w:val="19"/>
+              </w:rPr>
+            </w:r>
+            <w:r>
+              <w:rPr>
+                <w:b/>
+                <w:sz w:val="19"/>
+              </w:rPr>
+              <w:t>66 hours</w:t>
+            </w:r>
+          </w:p>
+        </w:tc>
+        <w:tc>
+          <w:tcPr>
+            <w:tcW w:type="dxa" w:w="2296"/>
+            <w:shd w:val="clear" w:fill="F2F7F7"/>
+          </w:tcPr>
+          <w:p>
+            <w:r>
+              <w:rPr>
+                <w:sz w:val="19"/>
+              </w:rPr>
+            </w:r>
+            <w:r>
+              <w:rPr>
+                <w:b/>
+                <w:sz w:val="19"/>
+              </w:rPr>
+              <w:t>$108.52/hr blended</w:t>
+            </w:r>
+          </w:p>
+        </w:tc>
+        <w:tc>
+          <w:tcPr>
+            <w:tcW w:type="dxa" w:w="2296"/>
+            <w:shd w:val="clear" w:fill="F2F7F7"/>
+          </w:tcPr>
+          <w:p>
+            <w:r>
+              <w:rPr>
+                <w:sz w:val="19"/>
+              </w:rPr>
+            </w:r>
+            <w:r>
+              <w:rPr>
+                <w:b/>
+                <w:sz w:val="19"/>
+              </w:rPr>
+              <w:t>$7,162.50 ex GST</w:t>
+            </w:r>
+          </w:p>
+        </w:tc>
+      </w:tr>
+    </w:tbl>
+    <w:p/>
+    <w:p>
+      <w:r>
+        <w:rPr>
+          <w:b/>
+        </w:rPr>
+        <w:t>Total inc GST: $7,878.75. Fixed price.</w:t>
+      </w:r>
+    </w:p>
+    <w:p>
+      <w:pPr>
+        <w:pStyle w:val="Heading3"/>
+        <w:spacing w:before="240" w:after="80"/>
+      </w:pPr>
+      <w:r>
+        <w:rPr>
+          <w:rFonts w:ascii="Calibri" w:hAnsi="Calibri"/>
+          <w:b/>
+          <w:color w:val="1F2937"/>
+          <w:sz w:val="25"/>
+        </w:rPr>
+        <w:t>Work breakdown - what each discipline does</w:t>
+      </w:r>
+    </w:p>
+    <w:p>
+      <w:r>
+        <w:t>Indicative basis of estimate, on the same terms as the module quotes: this is the engineering work behind the fixed price, itemised so the effort is visible. Tasks are not individually severable from the fixed price and do not change the acceptance basis; the deliverable is the working capability described in sections 1 to 8.</w:t>
       </w:r>
     </w:p>
     <w:tbl>
@@ -377,7 +984,7 @@
                 <w:color w:val="FFFFFF"/>
                 <w:sz w:val="19"/>
               </w:rPr>
-              <w:t>Work item</w:t>
+              <w:t>UX / Design - $100.00/hr</w:t>
             </w:r>
           </w:p>
         </w:tc>
@@ -400,7 +1007,7 @@
                 <w:color w:val="FFFFFF"/>
                 <w:sz w:val="19"/>
               </w:rPr>
-              <w:t>Effort</w:t>
+              <w:t>Est. hours</w:t>
             </w:r>
           </w:p>
         </w:tc>
@@ -420,7 +1027,7 @@
               <w:rPr>
                 <w:sz w:val="19"/>
               </w:rPr>
-              <w:t>Append-only audit store, schema and writer</w:t>
+              <w:t>Wireframe the audit register table, filter bar and changed-fields detail, including empty and error states</w:t>
             </w:r>
           </w:p>
         </w:tc>
@@ -438,7 +1045,7 @@
               <w:rPr>
                 <w:sz w:val="19"/>
               </w:rPr>
-              <w:t>1.0 day</w:t>
+              <w:t>1.5</w:t>
             </w:r>
           </w:p>
         </w:tc>
@@ -459,7 +1066,7 @@
               <w:rPr>
                 <w:sz w:val="19"/>
               </w:rPr>
-              <w:t>Instrumentation of all content mutation services and routes across both content systems (about fourteen surfaces)</w:t>
+              <w:t>Dark-mode and mobile QA pass on the register and filters</w:t>
             </w:r>
           </w:p>
         </w:tc>
@@ -478,7 +1085,108 @@
               <w:rPr>
                 <w:sz w:val="19"/>
               </w:rPr>
-              <w:t>2.5 days</w:t>
+              <w:t>0.5</w:t>
+            </w:r>
+          </w:p>
+        </w:tc>
+      </w:tr>
+      <w:tr>
+        <w:tc>
+          <w:tcPr>
+            <w:tcW w:type="dxa" w:w="4592"/>
+          </w:tcPr>
+          <w:p>
+            <w:r>
+              <w:rPr>
+                <w:sz w:val="19"/>
+              </w:rPr>
+            </w:r>
+            <w:r>
+              <w:rPr>
+                <w:b/>
+                <w:sz w:val="19"/>
+              </w:rPr>
+              <w:t>Subtotal</w:t>
+            </w:r>
+          </w:p>
+        </w:tc>
+        <w:tc>
+          <w:tcPr>
+            <w:tcW w:type="dxa" w:w="4592"/>
+          </w:tcPr>
+          <w:p>
+            <w:r>
+              <w:rPr>
+                <w:sz w:val="19"/>
+              </w:rPr>
+            </w:r>
+            <w:r>
+              <w:rPr>
+                <w:b/>
+                <w:sz w:val="19"/>
+              </w:rPr>
+              <w:t>2 h - $200.00</w:t>
+            </w:r>
+          </w:p>
+        </w:tc>
+      </w:tr>
+    </w:tbl>
+    <w:p/>
+    <w:tbl>
+      <w:tblPr>
+        <w:tblStyle w:val="TableGrid"/>
+        <w:tblW w:type="auto" w:w="0"/>
+        <w:jc w:val="left"/>
+        <w:tblLook w:firstColumn="1" w:firstRow="1" w:lastColumn="0" w:lastRow="0" w:noHBand="0" w:noVBand="1" w:val="04A0"/>
+      </w:tblPr>
+      <w:tblGrid>
+        <w:gridCol w:w="4592"/>
+        <w:gridCol w:w="4592"/>
+      </w:tblGrid>
+      <w:tr>
+        <w:tc>
+          <w:tcPr>
+            <w:tcW w:type="dxa" w:w="4592"/>
+            <w:shd w:val="clear" w:fill="008490"/>
+          </w:tcPr>
+          <w:p>
+            <w:r>
+              <w:rPr>
+                <w:b/>
+                <w:color w:val="FFFFFF"/>
+                <w:sz w:val="19"/>
+              </w:rPr>
+            </w:r>
+            <w:r>
+              <w:rPr>
+                <w:b/>
+                <w:color w:val="FFFFFF"/>
+                <w:sz w:val="19"/>
+              </w:rPr>
+              <w:t>Frontend - $106.25/hr</w:t>
+            </w:r>
+          </w:p>
+        </w:tc>
+        <w:tc>
+          <w:tcPr>
+            <w:tcW w:type="dxa" w:w="4592"/>
+            <w:shd w:val="clear" w:fill="008490"/>
+          </w:tcPr>
+          <w:p>
+            <w:r>
+              <w:rPr>
+                <w:b/>
+                <w:color w:val="FFFFFF"/>
+                <w:sz w:val="19"/>
+              </w:rPr>
+            </w:r>
+            <w:r>
+              <w:rPr>
+                <w:b/>
+                <w:color w:val="FFFFFF"/>
+                <w:sz w:val="19"/>
+              </w:rPr>
+              <w:t>Est. hours</w:t>
             </w:r>
           </w:p>
         </w:tc>
@@ -498,7 +1206,7 @@
               <w:rPr>
                 <w:sz w:val="19"/>
               </w:rPr>
-              <w:t>Audit Logs workspace: register, filters, pagination, CSV export</w:t>
+              <w:t>Build entities/audit-logs TanStack Query hooks (endpoints, query keys) with filter parameters</w:t>
             </w:r>
           </w:p>
         </w:tc>
@@ -516,7 +1224,7 @@
               <w:rPr>
                 <w:sz w:val="19"/>
               </w:rPr>
-              <w:t>1.5 days</w:t>
+              <w:t>2</w:t>
             </w:r>
           </w:p>
         </w:tc>
@@ -537,7 +1245,7 @@
               <w:rPr>
                 <w:sz w:val="19"/>
               </w:rPr>
-              <w:t>Tests, acceptance verification and live demonstration</w:t>
+              <w:t>Replace the stub admin Audit Logs page with the paginated, newest-first register</w:t>
             </w:r>
           </w:p>
         </w:tc>
@@ -556,7 +1264,163 @@
               <w:rPr>
                 <w:sz w:val="19"/>
               </w:rPr>
-              <w:t>0.5 days</w:t>
+              <w:t>4</w:t>
+            </w:r>
+          </w:p>
+        </w:tc>
+      </w:tr>
+      <w:tr>
+        <w:tc>
+          <w:tcPr>
+            <w:tcW w:type="dxa" w:w="4592"/>
+          </w:tcPr>
+          <w:p>
+            <w:r>
+              <w:rPr>
+                <w:sz w:val="19"/>
+              </w:rPr>
+            </w:r>
+            <w:r>
+              <w:rPr>
+                <w:sz w:val="19"/>
+              </w:rPr>
+              <w:t>Loading skeleton, empty and error states plus cursor load-more on the register</w:t>
+            </w:r>
+          </w:p>
+        </w:tc>
+        <w:tc>
+          <w:tcPr>
+            <w:tcW w:type="dxa" w:w="4592"/>
+          </w:tcPr>
+          <w:p>
+            <w:r>
+              <w:rPr>
+                <w:sz w:val="19"/>
+              </w:rPr>
+            </w:r>
+            <w:r>
+              <w:rPr>
+                <w:sz w:val="19"/>
+              </w:rPr>
+              <w:t>3</w:t>
+            </w:r>
+          </w:p>
+        </w:tc>
+      </w:tr>
+      <w:tr>
+        <w:tc>
+          <w:tcPr>
+            <w:tcW w:type="dxa" w:w="4592"/>
+            <w:shd w:val="clear" w:fill="F2F7F7"/>
+          </w:tcPr>
+          <w:p>
+            <w:r>
+              <w:rPr>
+                <w:sz w:val="19"/>
+              </w:rPr>
+            </w:r>
+            <w:r>
+              <w:rPr>
+                <w:sz w:val="19"/>
+              </w:rPr>
+              <w:t>Filter bar: date-range picker, user search, entity-type and action selects</w:t>
+            </w:r>
+          </w:p>
+        </w:tc>
+        <w:tc>
+          <w:tcPr>
+            <w:tcW w:type="dxa" w:w="4592"/>
+            <w:shd w:val="clear" w:fill="F2F7F7"/>
+          </w:tcPr>
+          <w:p>
+            <w:r>
+              <w:rPr>
+                <w:sz w:val="19"/>
+              </w:rPr>
+            </w:r>
+            <w:r>
+              <w:rPr>
+                <w:sz w:val="19"/>
+              </w:rPr>
+              <w:t>4</w:t>
+            </w:r>
+          </w:p>
+        </w:tc>
+      </w:tr>
+      <w:tr>
+        <w:tc>
+          <w:tcPr>
+            <w:tcW w:type="dxa" w:w="4592"/>
+          </w:tcPr>
+          <w:p>
+            <w:r>
+              <w:rPr>
+                <w:sz w:val="19"/>
+              </w:rPr>
+            </w:r>
+            <w:r>
+              <w:rPr>
+                <w:sz w:val="19"/>
+              </w:rPr>
+              <w:t>Changed-fields summary detail on row expand</w:t>
+            </w:r>
+          </w:p>
+        </w:tc>
+        <w:tc>
+          <w:tcPr>
+            <w:tcW w:type="dxa" w:w="4592"/>
+          </w:tcPr>
+          <w:p>
+            <w:r>
+              <w:rPr>
+                <w:sz w:val="19"/>
+              </w:rPr>
+            </w:r>
+            <w:r>
+              <w:rPr>
+                <w:sz w:val="19"/>
+              </w:rPr>
+              <w:t>2</w:t>
+            </w:r>
+          </w:p>
+        </w:tc>
+      </w:tr>
+      <w:tr>
+        <w:tc>
+          <w:tcPr>
+            <w:tcW w:type="dxa" w:w="4592"/>
+            <w:shd w:val="clear" w:fill="F2F7F7"/>
+          </w:tcPr>
+          <w:p>
+            <w:r>
+              <w:rPr>
+                <w:sz w:val="19"/>
+              </w:rPr>
+            </w:r>
+            <w:r>
+              <w:rPr>
+                <w:sz w:val="19"/>
+              </w:rPr>
+              <w:t>CSV export button wired to the export route</w:t>
+            </w:r>
+          </w:p>
+        </w:tc>
+        <w:tc>
+          <w:tcPr>
+            <w:tcW w:type="dxa" w:w="4592"/>
+            <w:shd w:val="clear" w:fill="F2F7F7"/>
+          </w:tcPr>
+          <w:p>
+            <w:r>
+              <w:rPr>
+                <w:sz w:val="19"/>
+              </w:rPr>
+            </w:r>
+            <w:r>
+              <w:rPr>
+                <w:sz w:val="19"/>
+              </w:rPr>
+              <w:t>1</w:t>
             </w:r>
           </w:p>
         </w:tc>
@@ -577,7 +1441,7 @@
                 <w:b/>
                 <w:sz w:val="19"/>
               </w:rPr>
-              <w:t>Total: 5.5 days at $2,900</w:t>
+              <w:t>Subtotal</w:t>
             </w:r>
           </w:p>
         </w:tc>
@@ -596,7 +1460,974 @@
                 <w:b/>
                 <w:sz w:val="19"/>
               </w:rPr>
-              <w:t>$15,950 + GST, fixed</w:t>
+              <w:t>16 h - $1,700.00</w:t>
+            </w:r>
+          </w:p>
+        </w:tc>
+      </w:tr>
+    </w:tbl>
+    <w:p/>
+    <w:tbl>
+      <w:tblPr>
+        <w:tblStyle w:val="TableGrid"/>
+        <w:tblW w:type="auto" w:w="0"/>
+        <w:jc w:val="left"/>
+        <w:tblLook w:firstColumn="1" w:firstRow="1" w:lastColumn="0" w:lastRow="0" w:noHBand="0" w:noVBand="1" w:val="04A0"/>
+      </w:tblPr>
+      <w:tblGrid>
+        <w:gridCol w:w="4592"/>
+        <w:gridCol w:w="4592"/>
+      </w:tblGrid>
+      <w:tr>
+        <w:tc>
+          <w:tcPr>
+            <w:tcW w:type="dxa" w:w="4592"/>
+            <w:shd w:val="clear" w:fill="008490"/>
+          </w:tcPr>
+          <w:p>
+            <w:r>
+              <w:rPr>
+                <w:b/>
+                <w:color w:val="FFFFFF"/>
+                <w:sz w:val="19"/>
+              </w:rPr>
+            </w:r>
+            <w:r>
+              <w:rPr>
+                <w:b/>
+                <w:color w:val="FFFFFF"/>
+                <w:sz w:val="19"/>
+              </w:rPr>
+              <w:t>Backend - $112.50/hr</w:t>
+            </w:r>
+          </w:p>
+        </w:tc>
+        <w:tc>
+          <w:tcPr>
+            <w:tcW w:type="dxa" w:w="4592"/>
+            <w:shd w:val="clear" w:fill="008490"/>
+          </w:tcPr>
+          <w:p>
+            <w:r>
+              <w:rPr>
+                <w:b/>
+                <w:color w:val="FFFFFF"/>
+                <w:sz w:val="19"/>
+              </w:rPr>
+            </w:r>
+            <w:r>
+              <w:rPr>
+                <w:b/>
+                <w:color w:val="FFFFFF"/>
+                <w:sz w:val="19"/>
+              </w:rPr>
+              <w:t>Est. hours</w:t>
+            </w:r>
+          </w:p>
+        </w:tc>
+      </w:tr>
+      <w:tr>
+        <w:tc>
+          <w:tcPr>
+            <w:tcW w:type="dxa" w:w="4592"/>
+          </w:tcPr>
+          <w:p>
+            <w:r>
+              <w:rPr>
+                <w:sz w:val="19"/>
+              </w:rPr>
+            </w:r>
+            <w:r>
+              <w:rPr>
+                <w:sz w:val="19"/>
+              </w:rPr>
+              <w:t>content_audit_log table (acting user, access level, action, entity type, entity id, title, changed-field summary, UTC timestamp) plus migration</w:t>
+            </w:r>
+          </w:p>
+        </w:tc>
+        <w:tc>
+          <w:tcPr>
+            <w:tcW w:type="dxa" w:w="4592"/>
+          </w:tcPr>
+          <w:p>
+            <w:r>
+              <w:rPr>
+                <w:sz w:val="19"/>
+              </w:rPr>
+            </w:r>
+            <w:r>
+              <w:rPr>
+                <w:sz w:val="19"/>
+              </w:rPr>
+              <w:t>3</w:t>
+            </w:r>
+          </w:p>
+        </w:tc>
+      </w:tr>
+      <w:tr>
+        <w:tc>
+          <w:tcPr>
+            <w:tcW w:type="dxa" w:w="4592"/>
+            <w:shd w:val="clear" w:fill="F2F7F7"/>
+          </w:tcPr>
+          <w:p>
+            <w:r>
+              <w:rPr>
+                <w:sz w:val="19"/>
+              </w:rPr>
+            </w:r>
+            <w:r>
+              <w:rPr>
+                <w:sz w:val="19"/>
+              </w:rPr>
+              <w:t>Append-only enforcement: no update or delete path at any access level, including Bullyproof Admin; backup inclusion verified</w:t>
+            </w:r>
+          </w:p>
+        </w:tc>
+        <w:tc>
+          <w:tcPr>
+            <w:tcW w:type="dxa" w:w="4592"/>
+            <w:shd w:val="clear" w:fill="F2F7F7"/>
+          </w:tcPr>
+          <w:p>
+            <w:r>
+              <w:rPr>
+                <w:sz w:val="19"/>
+              </w:rPr>
+            </w:r>
+            <w:r>
+              <w:rPr>
+                <w:sz w:val="19"/>
+              </w:rPr>
+              <w:t>2</w:t>
+            </w:r>
+          </w:p>
+        </w:tc>
+      </w:tr>
+      <w:tr>
+        <w:tc>
+          <w:tcPr>
+            <w:tcW w:type="dxa" w:w="4592"/>
+          </w:tcPr>
+          <w:p>
+            <w:r>
+              <w:rPr>
+                <w:sz w:val="19"/>
+              </w:rPr>
+            </w:r>
+            <w:r>
+              <w:rPr>
+                <w:sz w:val="19"/>
+              </w:rPr>
+              <w:t>Audit repo and service with a typed recordContentEvent() helper</w:t>
+            </w:r>
+          </w:p>
+        </w:tc>
+        <w:tc>
+          <w:tcPr>
+            <w:tcW w:type="dxa" w:w="4592"/>
+          </w:tcPr>
+          <w:p>
+            <w:r>
+              <w:rPr>
+                <w:sz w:val="19"/>
+              </w:rPr>
+            </w:r>
+            <w:r>
+              <w:rPr>
+                <w:sz w:val="19"/>
+              </w:rPr>
+              <w:t>4</w:t>
+            </w:r>
+          </w:p>
+        </w:tc>
+      </w:tr>
+      <w:tr>
+        <w:tc>
+          <w:tcPr>
+            <w:tcW w:type="dxa" w:w="4592"/>
+            <w:shd w:val="clear" w:fill="F2F7F7"/>
+          </w:tcPr>
+          <w:p>
+            <w:r>
+              <w:rPr>
+                <w:sz w:val="19"/>
+              </w:rPr>
+            </w:r>
+            <w:r>
+              <w:rPr>
+                <w:sz w:val="19"/>
+              </w:rPr>
+              <w:t>Changed-field summary computation in the audit writer (per-entity field diffs)</w:t>
+            </w:r>
+          </w:p>
+        </w:tc>
+        <w:tc>
+          <w:tcPr>
+            <w:tcW w:type="dxa" w:w="4592"/>
+            <w:shd w:val="clear" w:fill="F2F7F7"/>
+          </w:tcPr>
+          <w:p>
+            <w:r>
+              <w:rPr>
+                <w:sz w:val="19"/>
+              </w:rPr>
+            </w:r>
+            <w:r>
+              <w:rPr>
+                <w:sz w:val="19"/>
+              </w:rPr>
+              <w:t>4</w:t>
+            </w:r>
+          </w:p>
+        </w:tc>
+      </w:tr>
+      <w:tr>
+        <w:tc>
+          <w:tcPr>
+            <w:tcW w:type="dxa" w:w="4592"/>
+          </w:tcPr>
+          <w:p>
+            <w:r>
+              <w:rPr>
+                <w:sz w:val="19"/>
+              </w:rPr>
+            </w:r>
+            <w:r>
+              <w:rPr>
+                <w:sz w:val="19"/>
+              </w:rPr>
+              <w:t>Instrument curriculum services: stages, topics, topic slides (create, edit, delete, reorder)</w:t>
+            </w:r>
+          </w:p>
+        </w:tc>
+        <w:tc>
+          <w:tcPr>
+            <w:tcW w:type="dxa" w:w="4592"/>
+          </w:tcPr>
+          <w:p>
+            <w:r>
+              <w:rPr>
+                <w:sz w:val="19"/>
+              </w:rPr>
+            </w:r>
+            <w:r>
+              <w:rPr>
+                <w:sz w:val="19"/>
+              </w:rPr>
+              <w:t>5</w:t>
+            </w:r>
+          </w:p>
+        </w:tc>
+      </w:tr>
+      <w:tr>
+        <w:tc>
+          <w:tcPr>
+            <w:tcW w:type="dxa" w:w="4592"/>
+            <w:shd w:val="clear" w:fill="F2F7F7"/>
+          </w:tcPr>
+          <w:p>
+            <w:r>
+              <w:rPr>
+                <w:sz w:val="19"/>
+              </w:rPr>
+            </w:r>
+            <w:r>
+              <w:rPr>
+                <w:sz w:val="19"/>
+              </w:rPr>
+              <w:t>Instrument certification services: courses, course topics, course topic slides (create, edit, delete, reorder)</w:t>
+            </w:r>
+          </w:p>
+        </w:tc>
+        <w:tc>
+          <w:tcPr>
+            <w:tcW w:type="dxa" w:w="4592"/>
+            <w:shd w:val="clear" w:fill="F2F7F7"/>
+          </w:tcPr>
+          <w:p>
+            <w:r>
+              <w:rPr>
+                <w:sz w:val="19"/>
+              </w:rPr>
+            </w:r>
+            <w:r>
+              <w:rPr>
+                <w:sz w:val="19"/>
+              </w:rPr>
+              <w:t>5</w:t>
+            </w:r>
+          </w:p>
+        </w:tc>
+      </w:tr>
+      <w:tr>
+        <w:tc>
+          <w:tcPr>
+            <w:tcW w:type="dxa" w:w="4592"/>
+          </w:tcPr>
+          <w:p>
+            <w:r>
+              <w:rPr>
+                <w:sz w:val="19"/>
+              </w:rPr>
+            </w:r>
+            <w:r>
+              <w:rPr>
+                <w:sz w:val="19"/>
+              </w:rPr>
+              <w:t>Instrument quizzes, quiz questions and quiz answers</w:t>
+            </w:r>
+          </w:p>
+        </w:tc>
+        <w:tc>
+          <w:tcPr>
+            <w:tcW w:type="dxa" w:w="4592"/>
+          </w:tcPr>
+          <w:p>
+            <w:r>
+              <w:rPr>
+                <w:sz w:val="19"/>
+              </w:rPr>
+            </w:r>
+            <w:r>
+              <w:rPr>
+                <w:sz w:val="19"/>
+              </w:rPr>
+              <w:t>3</w:t>
+            </w:r>
+          </w:p>
+        </w:tc>
+      </w:tr>
+      <w:tr>
+        <w:tc>
+          <w:tcPr>
+            <w:tcW w:type="dxa" w:w="4592"/>
+            <w:shd w:val="clear" w:fill="F2F7F7"/>
+          </w:tcPr>
+          <w:p>
+            <w:r>
+              <w:rPr>
+                <w:sz w:val="19"/>
+              </w:rPr>
+            </w:r>
+            <w:r>
+              <w:rPr>
+                <w:sz w:val="19"/>
+              </w:rPr>
+              <w:t>Audit-logs list route with date, user, entity-type and action filters plus cursor pagination</w:t>
+            </w:r>
+          </w:p>
+        </w:tc>
+        <w:tc>
+          <w:tcPr>
+            <w:tcW w:type="dxa" w:w="4592"/>
+            <w:shd w:val="clear" w:fill="F2F7F7"/>
+          </w:tcPr>
+          <w:p>
+            <w:r>
+              <w:rPr>
+                <w:sz w:val="19"/>
+              </w:rPr>
+            </w:r>
+            <w:r>
+              <w:rPr>
+                <w:sz w:val="19"/>
+              </w:rPr>
+              <w:t>4</w:t>
+            </w:r>
+          </w:p>
+        </w:tc>
+      </w:tr>
+      <w:tr>
+        <w:tc>
+          <w:tcPr>
+            <w:tcW w:type="dxa" w:w="4592"/>
+          </w:tcPr>
+          <w:p>
+            <w:r>
+              <w:rPr>
+                <w:sz w:val="19"/>
+              </w:rPr>
+            </w:r>
+            <w:r>
+              <w:rPr>
+                <w:sz w:val="19"/>
+              </w:rPr>
+              <w:t>CSV export route over the filtered result set (including the changed-field summary column)</w:t>
+            </w:r>
+          </w:p>
+        </w:tc>
+        <w:tc>
+          <w:tcPr>
+            <w:tcW w:type="dxa" w:w="4592"/>
+          </w:tcPr>
+          <w:p>
+            <w:r>
+              <w:rPr>
+                <w:sz w:val="19"/>
+              </w:rPr>
+            </w:r>
+            <w:r>
+              <w:rPr>
+                <w:sz w:val="19"/>
+              </w:rPr>
+              <w:t>3</w:t>
+            </w:r>
+          </w:p>
+        </w:tc>
+      </w:tr>
+      <w:tr>
+        <w:tc>
+          <w:tcPr>
+            <w:tcW w:type="dxa" w:w="4592"/>
+            <w:shd w:val="clear" w:fill="F2F7F7"/>
+          </w:tcPr>
+          <w:p>
+            <w:r>
+              <w:rPr>
+                <w:sz w:val="19"/>
+              </w:rPr>
+            </w:r>
+            <w:r>
+              <w:rPr>
+                <w:sz w:val="19"/>
+              </w:rPr>
+              <w:t>Tests: exactly one audit row per action per entity type, every section 3 field present</w:t>
+            </w:r>
+          </w:p>
+        </w:tc>
+        <w:tc>
+          <w:tcPr>
+            <w:tcW w:type="dxa" w:w="4592"/>
+            <w:shd w:val="clear" w:fill="F2F7F7"/>
+          </w:tcPr>
+          <w:p>
+            <w:r>
+              <w:rPr>
+                <w:sz w:val="19"/>
+              </w:rPr>
+            </w:r>
+            <w:r>
+              <w:rPr>
+                <w:sz w:val="19"/>
+              </w:rPr>
+              <w:t>3</w:t>
+            </w:r>
+          </w:p>
+        </w:tc>
+      </w:tr>
+      <w:tr>
+        <w:tc>
+          <w:tcPr>
+            <w:tcW w:type="dxa" w:w="4592"/>
+          </w:tcPr>
+          <w:p>
+            <w:r>
+              <w:rPr>
+                <w:sz w:val="19"/>
+              </w:rPr>
+            </w:r>
+            <w:r>
+              <w:rPr>
+                <w:sz w:val="19"/>
+              </w:rPr>
+              <w:t>Tests: append-only enforcement; attempted mutation paths return authorisation errors</w:t>
+            </w:r>
+          </w:p>
+        </w:tc>
+        <w:tc>
+          <w:tcPr>
+            <w:tcW w:type="dxa" w:w="4592"/>
+          </w:tcPr>
+          <w:p>
+            <w:r>
+              <w:rPr>
+                <w:sz w:val="19"/>
+              </w:rPr>
+            </w:r>
+            <w:r>
+              <w:rPr>
+                <w:sz w:val="19"/>
+              </w:rPr>
+              <w:t>2</w:t>
+            </w:r>
+          </w:p>
+        </w:tc>
+      </w:tr>
+      <w:tr>
+        <w:tc>
+          <w:tcPr>
+            <w:tcW w:type="dxa" w:w="4592"/>
+            <w:shd w:val="clear" w:fill="F2F7F7"/>
+          </w:tcPr>
+          <w:p>
+            <w:r>
+              <w:rPr>
+                <w:sz w:val="19"/>
+              </w:rPr>
+            </w:r>
+            <w:r>
+              <w:rPr>
+                <w:b/>
+                <w:sz w:val="19"/>
+              </w:rPr>
+              <w:t>Subtotal</w:t>
+            </w:r>
+          </w:p>
+        </w:tc>
+        <w:tc>
+          <w:tcPr>
+            <w:tcW w:type="dxa" w:w="4592"/>
+            <w:shd w:val="clear" w:fill="F2F7F7"/>
+          </w:tcPr>
+          <w:p>
+            <w:r>
+              <w:rPr>
+                <w:sz w:val="19"/>
+              </w:rPr>
+            </w:r>
+            <w:r>
+              <w:rPr>
+                <w:b/>
+                <w:sz w:val="19"/>
+              </w:rPr>
+              <w:t>38 h - $4,275.00</w:t>
+            </w:r>
+          </w:p>
+        </w:tc>
+      </w:tr>
+    </w:tbl>
+    <w:p/>
+    <w:tbl>
+      <w:tblPr>
+        <w:tblStyle w:val="TableGrid"/>
+        <w:tblW w:type="auto" w:w="0"/>
+        <w:jc w:val="left"/>
+        <w:tblLook w:firstColumn="1" w:firstRow="1" w:lastColumn="0" w:lastRow="0" w:noHBand="0" w:noVBand="1" w:val="04A0"/>
+      </w:tblPr>
+      <w:tblGrid>
+        <w:gridCol w:w="4592"/>
+        <w:gridCol w:w="4592"/>
+      </w:tblGrid>
+      <w:tr>
+        <w:tc>
+          <w:tcPr>
+            <w:tcW w:type="dxa" w:w="4592"/>
+            <w:shd w:val="clear" w:fill="008490"/>
+          </w:tcPr>
+          <w:p>
+            <w:r>
+              <w:rPr>
+                <w:b/>
+                <w:color w:val="FFFFFF"/>
+                <w:sz w:val="19"/>
+              </w:rPr>
+            </w:r>
+            <w:r>
+              <w:rPr>
+                <w:b/>
+                <w:color w:val="FFFFFF"/>
+                <w:sz w:val="19"/>
+              </w:rPr>
+              <w:t>DevOps / Infra - $118.75/hr</w:t>
+            </w:r>
+          </w:p>
+        </w:tc>
+        <w:tc>
+          <w:tcPr>
+            <w:tcW w:type="dxa" w:w="4592"/>
+            <w:shd w:val="clear" w:fill="008490"/>
+          </w:tcPr>
+          <w:p>
+            <w:r>
+              <w:rPr>
+                <w:b/>
+                <w:color w:val="FFFFFF"/>
+                <w:sz w:val="19"/>
+              </w:rPr>
+            </w:r>
+            <w:r>
+              <w:rPr>
+                <w:b/>
+                <w:color w:val="FFFFFF"/>
+                <w:sz w:val="19"/>
+              </w:rPr>
+              <w:t>Est. hours</w:t>
+            </w:r>
+          </w:p>
+        </w:tc>
+      </w:tr>
+      <w:tr>
+        <w:tc>
+          <w:tcPr>
+            <w:tcW w:type="dxa" w:w="4592"/>
+          </w:tcPr>
+          <w:p>
+            <w:r>
+              <w:rPr>
+                <w:sz w:val="19"/>
+              </w:rPr>
+            </w:r>
+            <w:r>
+              <w:rPr>
+                <w:sz w:val="19"/>
+              </w:rPr>
+              <w:t>Apply the migration to production Supabase; verify row-level security and backup inclusion</w:t>
+            </w:r>
+          </w:p>
+        </w:tc>
+        <w:tc>
+          <w:tcPr>
+            <w:tcW w:type="dxa" w:w="4592"/>
+          </w:tcPr>
+          <w:p>
+            <w:r>
+              <w:rPr>
+                <w:sz w:val="19"/>
+              </w:rPr>
+            </w:r>
+            <w:r>
+              <w:rPr>
+                <w:sz w:val="19"/>
+              </w:rPr>
+              <w:t>1.25</w:t>
+            </w:r>
+          </w:p>
+        </w:tc>
+      </w:tr>
+      <w:tr>
+        <w:tc>
+          <w:tcPr>
+            <w:tcW w:type="dxa" w:w="4592"/>
+            <w:shd w:val="clear" w:fill="F2F7F7"/>
+          </w:tcPr>
+          <w:p>
+            <w:r>
+              <w:rPr>
+                <w:sz w:val="19"/>
+              </w:rPr>
+            </w:r>
+            <w:r>
+              <w:rPr>
+                <w:sz w:val="19"/>
+              </w:rPr>
+              <w:t>Monitor the new routes after deployment</w:t>
+            </w:r>
+          </w:p>
+        </w:tc>
+        <w:tc>
+          <w:tcPr>
+            <w:tcW w:type="dxa" w:w="4592"/>
+            <w:shd w:val="clear" w:fill="F2F7F7"/>
+          </w:tcPr>
+          <w:p>
+            <w:r>
+              <w:rPr>
+                <w:sz w:val="19"/>
+              </w:rPr>
+            </w:r>
+            <w:r>
+              <w:rPr>
+                <w:sz w:val="19"/>
+              </w:rPr>
+              <w:t>0.75</w:t>
+            </w:r>
+          </w:p>
+        </w:tc>
+      </w:tr>
+      <w:tr>
+        <w:tc>
+          <w:tcPr>
+            <w:tcW w:type="dxa" w:w="4592"/>
+          </w:tcPr>
+          <w:p>
+            <w:r>
+              <w:rPr>
+                <w:sz w:val="19"/>
+              </w:rPr>
+            </w:r>
+            <w:r>
+              <w:rPr>
+                <w:b/>
+                <w:sz w:val="19"/>
+              </w:rPr>
+              <w:t>Subtotal</w:t>
+            </w:r>
+          </w:p>
+        </w:tc>
+        <w:tc>
+          <w:tcPr>
+            <w:tcW w:type="dxa" w:w="4592"/>
+          </w:tcPr>
+          <w:p>
+            <w:r>
+              <w:rPr>
+                <w:sz w:val="19"/>
+              </w:rPr>
+            </w:r>
+            <w:r>
+              <w:rPr>
+                <w:b/>
+                <w:sz w:val="19"/>
+              </w:rPr>
+              <w:t>2 h - $237.50</w:t>
+            </w:r>
+          </w:p>
+        </w:tc>
+      </w:tr>
+    </w:tbl>
+    <w:p/>
+    <w:tbl>
+      <w:tblPr>
+        <w:tblStyle w:val="TableGrid"/>
+        <w:tblW w:type="auto" w:w="0"/>
+        <w:jc w:val="left"/>
+        <w:tblLook w:firstColumn="1" w:firstRow="1" w:lastColumn="0" w:lastRow="0" w:noHBand="0" w:noVBand="1" w:val="04A0"/>
+      </w:tblPr>
+      <w:tblGrid>
+        <w:gridCol w:w="4592"/>
+        <w:gridCol w:w="4592"/>
+      </w:tblGrid>
+      <w:tr>
+        <w:tc>
+          <w:tcPr>
+            <w:tcW w:type="dxa" w:w="4592"/>
+            <w:shd w:val="clear" w:fill="008490"/>
+          </w:tcPr>
+          <w:p>
+            <w:r>
+              <w:rPr>
+                <w:b/>
+                <w:color w:val="FFFFFF"/>
+                <w:sz w:val="19"/>
+              </w:rPr>
+            </w:r>
+            <w:r>
+              <w:rPr>
+                <w:b/>
+                <w:color w:val="FFFFFF"/>
+                <w:sz w:val="19"/>
+              </w:rPr>
+              <w:t>Product Mgmt / BA - $93.75/hr</w:t>
+            </w:r>
+          </w:p>
+        </w:tc>
+        <w:tc>
+          <w:tcPr>
+            <w:tcW w:type="dxa" w:w="4592"/>
+            <w:shd w:val="clear" w:fill="008490"/>
+          </w:tcPr>
+          <w:p>
+            <w:r>
+              <w:rPr>
+                <w:b/>
+                <w:color w:val="FFFFFF"/>
+                <w:sz w:val="19"/>
+              </w:rPr>
+            </w:r>
+            <w:r>
+              <w:rPr>
+                <w:b/>
+                <w:color w:val="FFFFFF"/>
+                <w:sz w:val="19"/>
+              </w:rPr>
+              <w:t>Est. hours</w:t>
+            </w:r>
+          </w:p>
+        </w:tc>
+      </w:tr>
+      <w:tr>
+        <w:tc>
+          <w:tcPr>
+            <w:tcW w:type="dxa" w:w="4592"/>
+          </w:tcPr>
+          <w:p>
+            <w:r>
+              <w:rPr>
+                <w:sz w:val="19"/>
+              </w:rPr>
+            </w:r>
+            <w:r>
+              <w:rPr>
+                <w:sz w:val="19"/>
+              </w:rPr>
+              <w:t>Confirm the event taxonomy and retention wording</w:t>
+            </w:r>
+          </w:p>
+        </w:tc>
+        <w:tc>
+          <w:tcPr>
+            <w:tcW w:type="dxa" w:w="4592"/>
+          </w:tcPr>
+          <w:p>
+            <w:r>
+              <w:rPr>
+                <w:sz w:val="19"/>
+              </w:rPr>
+            </w:r>
+            <w:r>
+              <w:rPr>
+                <w:sz w:val="19"/>
+              </w:rPr>
+              <w:t>2</w:t>
+            </w:r>
+          </w:p>
+        </w:tc>
+      </w:tr>
+      <w:tr>
+        <w:tc>
+          <w:tcPr>
+            <w:tcW w:type="dxa" w:w="4592"/>
+            <w:shd w:val="clear" w:fill="F2F7F7"/>
+          </w:tcPr>
+          <w:p>
+            <w:r>
+              <w:rPr>
+                <w:sz w:val="19"/>
+              </w:rPr>
+            </w:r>
+            <w:r>
+              <w:rPr>
+                <w:sz w:val="19"/>
+              </w:rPr>
+              <w:t>Test plan covering all fourteen instrumented surfaces</w:t>
+            </w:r>
+          </w:p>
+        </w:tc>
+        <w:tc>
+          <w:tcPr>
+            <w:tcW w:type="dxa" w:w="4592"/>
+            <w:shd w:val="clear" w:fill="F2F7F7"/>
+          </w:tcPr>
+          <w:p>
+            <w:r>
+              <w:rPr>
+                <w:sz w:val="19"/>
+              </w:rPr>
+            </w:r>
+            <w:r>
+              <w:rPr>
+                <w:sz w:val="19"/>
+              </w:rPr>
+              <w:t>2</w:t>
+            </w:r>
+          </w:p>
+        </w:tc>
+      </w:tr>
+      <w:tr>
+        <w:tc>
+          <w:tcPr>
+            <w:tcW w:type="dxa" w:w="4592"/>
+          </w:tcPr>
+          <w:p>
+            <w:r>
+              <w:rPr>
+                <w:sz w:val="19"/>
+              </w:rPr>
+            </w:r>
+            <w:r>
+              <w:rPr>
+                <w:sz w:val="19"/>
+              </w:rPr>
+              <w:t>Coordinate the UAT worked example on the St4s Test School (create, edit, delete, retrieve, export)</w:t>
+            </w:r>
+          </w:p>
+        </w:tc>
+        <w:tc>
+          <w:tcPr>
+            <w:tcW w:type="dxa" w:w="4592"/>
+          </w:tcPr>
+          <w:p>
+            <w:r>
+              <w:rPr>
+                <w:sz w:val="19"/>
+              </w:rPr>
+            </w:r>
+            <w:r>
+              <w:rPr>
+                <w:sz w:val="19"/>
+              </w:rPr>
+              <w:t>3</w:t>
+            </w:r>
+          </w:p>
+        </w:tc>
+      </w:tr>
+      <w:tr>
+        <w:tc>
+          <w:tcPr>
+            <w:tcW w:type="dxa" w:w="4592"/>
+            <w:shd w:val="clear" w:fill="F2F7F7"/>
+          </w:tcPr>
+          <w:p>
+            <w:r>
+              <w:rPr>
+                <w:sz w:val="19"/>
+              </w:rPr>
+            </w:r>
+            <w:r>
+              <w:rPr>
+                <w:sz w:val="19"/>
+              </w:rPr>
+              <w:t>Acceptance sign-off and release notes</w:t>
+            </w:r>
+          </w:p>
+        </w:tc>
+        <w:tc>
+          <w:tcPr>
+            <w:tcW w:type="dxa" w:w="4592"/>
+            <w:shd w:val="clear" w:fill="F2F7F7"/>
+          </w:tcPr>
+          <w:p>
+            <w:r>
+              <w:rPr>
+                <w:sz w:val="19"/>
+              </w:rPr>
+            </w:r>
+            <w:r>
+              <w:rPr>
+                <w:sz w:val="19"/>
+              </w:rPr>
+              <w:t>1</w:t>
+            </w:r>
+          </w:p>
+        </w:tc>
+      </w:tr>
+      <w:tr>
+        <w:tc>
+          <w:tcPr>
+            <w:tcW w:type="dxa" w:w="4592"/>
+          </w:tcPr>
+          <w:p>
+            <w:r>
+              <w:rPr>
+                <w:sz w:val="19"/>
+              </w:rPr>
+            </w:r>
+            <w:r>
+              <w:rPr>
+                <w:b/>
+                <w:sz w:val="19"/>
+              </w:rPr>
+              <w:t>Subtotal</w:t>
+            </w:r>
+          </w:p>
+        </w:tc>
+        <w:tc>
+          <w:tcPr>
+            <w:tcW w:type="dxa" w:w="4592"/>
+          </w:tcPr>
+          <w:p>
+            <w:r>
+              <w:rPr>
+                <w:sz w:val="19"/>
+              </w:rPr>
+            </w:r>
+            <w:r>
+              <w:rPr>
+                <w:b/>
+                <w:sz w:val="19"/>
+              </w:rPr>
+              <w:t>8 h - $750.00</w:t>
             </w:r>
           </w:p>
         </w:tc>
@@ -605,7 +2436,12 @@
     <w:p/>
     <w:p>
       <w:r>
-        <w:t>Commissioning follows the M1 pattern: 40% deposit on commissioning ($6,380 + GST), balance on delivery and acceptance against the criteria in section 8. The remainder of M5 (version comparison, rollback, visual change histories, step-up MFA, sole-editor lock) stays optional and unaffected.</w:t>
+        <w:t>For reconciliation against the M5 quote you hold: the audit-log line items within the M5 work breakdown cover about seven content surfaces; this minimum module covers fourteen (adding the quiz entities, stage- and course-level actions, and reorder events), and adds the changed-field summary capture and the hardened append-only acceptance tests. That is the difference between this module and the audit portion of M5. If the remainder of M5 is commissioned later, the M5 price is reduced by the overlapping delivered items so nothing is paid twice.</w:t>
+      </w:r>
+    </w:p>
+    <w:p>
+      <w:r>
+        <w:t>Commissioning follows the M1 pattern: 40% deposit on commissioning ($2,865.00 + GST), balance on delivery and acceptance against the criteria in section 8. Indicative delivery: about a week of focused build. The remainder of M5 (version comparison, rollback, visual change histories, step-up MFA, sole-editor lock) stays optional and unaffected.</w:t>
       </w:r>
     </w:p>
     <w:sectPr>

</xml_diff>